<commit_message>
Semana 05: Laboratorio 06 - Auditoria con AOP
</commit_message>
<xml_diff>
--- a/semana-05/GLAB-S05-RCOELLO-2026-01-1.docx
+++ b/semana-05/GLAB-S05-RCOELLO-2026-01-1.docx
@@ -1481,6 +1481,9 @@
         <w:pStyle w:val="Sinespaciado"/>
       </w:pPr>
       <w:r>
+        <w:rPr>
+          <w:noProof/>
+        </w:rPr>
         <w:drawing>
           <wp:inline distT="0" distB="0" distL="0" distR="0" wp14:anchorId="1C2A6026" wp14:editId="4D7ADFD7">
             <wp:extent cx="6120130" cy="2240915"/>
@@ -4324,15 +4327,7 @@
         <w:pStyle w:val="Sinespaciado"/>
       </w:pPr>
       <w:r>
-        <w:t xml:space="preserve">6.- </w:t>
-      </w:r>
-      <w:proofErr w:type="gramStart"/>
-      <w:r>
-        <w:t>Interface</w:t>
-      </w:r>
-      <w:proofErr w:type="gramEnd"/>
-      <w:r>
-        <w:t xml:space="preserve"> </w:t>
+        <w:t xml:space="preserve">6.- Interface </w:t>
       </w:r>
       <w:proofErr w:type="spellStart"/>
       <w:r>
@@ -4395,7 +4390,6 @@
         <w:t xml:space="preserve"> </w:t>
       </w:r>
       <w:proofErr w:type="spellStart"/>
-      <w:proofErr w:type="gramStart"/>
       <w:r>
         <w:rPr>
           <w:rFonts w:ascii="Courier New" w:eastAsia="Times New Roman" w:hAnsi="Courier New" w:cs="Courier New"/>
@@ -4403,17 +4397,7 @@
           <w:sz w:val="23"/>
           <w:szCs w:val="23"/>
         </w:rPr>
-        <w:t>com.tecsup</w:t>
-      </w:r>
-      <w:proofErr w:type="gramEnd"/>
-      <w:r>
-        <w:rPr>
-          <w:rFonts w:ascii="Courier New" w:eastAsia="Times New Roman" w:hAnsi="Courier New" w:cs="Courier New"/>
-          <w:color w:val="000000"/>
-          <w:sz w:val="23"/>
-          <w:szCs w:val="23"/>
-        </w:rPr>
-        <w:t>.repository</w:t>
+        <w:t>com.tecsup.repository</w:t>
       </w:r>
       <w:proofErr w:type="spellEnd"/>
       <w:r>
@@ -13587,6 +13571,9 @@
     </w:p>
     <w:p>
       <w:r>
+        <w:rPr>
+          <w:noProof/>
+        </w:rPr>
         <w:lastRenderedPageBreak/>
         <w:drawing>
           <wp:inline distT="0" distB="0" distL="0" distR="0" wp14:anchorId="38469098" wp14:editId="0C790214">
@@ -13803,17 +13790,12 @@
         <w:jc w:val="both"/>
       </w:pPr>
       <w:proofErr w:type="spellStart"/>
-      <w:proofErr w:type="gramStart"/>
       <w:r>
         <w:t>save</w:t>
       </w:r>
       <w:proofErr w:type="spellEnd"/>
       <w:r>
-        <w:t>(</w:t>
-      </w:r>
-      <w:proofErr w:type="gramEnd"/>
-      <w:r>
-        <w:t>)</w:t>
+        <w:t>()</w:t>
       </w:r>
     </w:p>
     <w:p>
@@ -13842,17 +13824,12 @@
         <w:jc w:val="both"/>
       </w:pPr>
       <w:proofErr w:type="spellStart"/>
-      <w:proofErr w:type="gramStart"/>
       <w:r>
         <w:t>findById</w:t>
       </w:r>
       <w:proofErr w:type="spellEnd"/>
       <w:r>
-        <w:t>(</w:t>
-      </w:r>
-      <w:proofErr w:type="gramEnd"/>
-      <w:r>
-        <w:t>)</w:t>
+        <w:t>()</w:t>
       </w:r>
     </w:p>
     <w:p>
@@ -13889,17 +13866,12 @@
         <w:jc w:val="both"/>
       </w:pPr>
       <w:proofErr w:type="spellStart"/>
-      <w:proofErr w:type="gramStart"/>
       <w:r>
         <w:t>findAll</w:t>
       </w:r>
       <w:proofErr w:type="spellEnd"/>
       <w:r>
-        <w:t>(</w:t>
-      </w:r>
-      <w:proofErr w:type="gramEnd"/>
-      <w:r>
-        <w:t>)</w:t>
+        <w:t>()</w:t>
       </w:r>
     </w:p>
     <w:p>
@@ -13968,6 +13940,9 @@
     </w:p>
     <w:p>
       <w:r>
+        <w:rPr>
+          <w:noProof/>
+        </w:rPr>
         <w:lastRenderedPageBreak/>
         <w:drawing>
           <wp:inline distT="0" distB="0" distL="0" distR="0" wp14:anchorId="3D8508D8" wp14:editId="060A1542">
@@ -14041,6 +14016,9 @@
         </w:drawing>
       </w:r>
       <w:r>
+        <w:rPr>
+          <w:noProof/>
+        </w:rPr>
         <w:drawing>
           <wp:inline distT="0" distB="0" distL="0" distR="0" wp14:anchorId="05ABC097" wp14:editId="2AABFF5A">
             <wp:extent cx="5832000" cy="2695742"/>
@@ -14113,6 +14091,9 @@
         </w:drawing>
       </w:r>
       <w:r>
+        <w:rPr>
+          <w:noProof/>
+        </w:rPr>
         <w:drawing>
           <wp:inline distT="0" distB="0" distL="0" distR="0" wp14:anchorId="12E57494" wp14:editId="18E77A6B">
             <wp:extent cx="5832000" cy="2721761"/>
@@ -14225,6 +14206,9 @@
     </w:p>
     <w:p>
       <w:r>
+        <w:rPr>
+          <w:noProof/>
+        </w:rPr>
         <w:drawing>
           <wp:inline distT="0" distB="0" distL="0" distR="0" wp14:anchorId="18BE0286" wp14:editId="731A0CA4">
             <wp:extent cx="5832000" cy="3768593"/>
@@ -14283,6 +14267,9 @@
     </w:p>
     <w:p>
       <w:r>
+        <w:rPr>
+          <w:noProof/>
+        </w:rPr>
         <w:drawing>
           <wp:inline distT="0" distB="0" distL="0" distR="0" wp14:anchorId="5E3A8008" wp14:editId="2726BA87">
             <wp:extent cx="5832000" cy="1432283"/>
@@ -14362,6 +14349,9 @@
     </w:p>
     <w:p>
       <w:r>
+        <w:rPr>
+          <w:noProof/>
+        </w:rPr>
         <w:drawing>
           <wp:inline distT="0" distB="0" distL="0" distR="0" wp14:anchorId="658BE086" wp14:editId="7F40F2EF">
             <wp:extent cx="5832000" cy="1780218"/>
@@ -14453,6 +14443,9 @@
     </w:p>
     <w:p>
       <w:r>
+        <w:rPr>
+          <w:noProof/>
+        </w:rPr>
         <w:drawing>
           <wp:inline distT="0" distB="0" distL="0" distR="0" wp14:anchorId="4F5CF54B" wp14:editId="7D21BC33">
             <wp:extent cx="5832000" cy="2754437"/>
@@ -14506,13 +14499,7 @@
     </w:p>
     <w:p>
       <w:r>
-        <w:t>La</w:t>
-      </w:r>
-      <w:r>
-        <w:t xml:space="preserve"> base de datos laboratorio_05</w:t>
-      </w:r>
-      <w:r>
-        <w:t xml:space="preserve"> Actualizado después del cambio con el PUT </w:t>
+        <w:t xml:space="preserve">La base de datos laboratorio_05 Actualizado después del cambio con el PUT </w:t>
       </w:r>
     </w:p>
     <w:p>
@@ -14525,6 +14512,9 @@
         </w:rPr>
       </w:pPr>
       <w:r>
+        <w:rPr>
+          <w:noProof/>
+        </w:rPr>
         <w:drawing>
           <wp:inline distT="0" distB="0" distL="0" distR="0" wp14:anchorId="6328DBBF" wp14:editId="2FF5A188">
             <wp:extent cx="5832000" cy="1448016"/>
@@ -14626,6 +14616,7 @@
         <w:rPr>
           <w:b/>
           <w:bCs/>
+          <w:noProof/>
           <w:sz w:val="24"/>
           <w:szCs w:val="24"/>
         </w:rPr>
@@ -14689,10 +14680,7 @@
         <w:t xml:space="preserve">La base de datos </w:t>
       </w:r>
       <w:r>
-        <w:t>laboratorio_05</w:t>
-      </w:r>
-      <w:r>
-        <w:t xml:space="preserve"> Actualizado</w:t>
+        <w:t>laboratorio_05 Actualizado</w:t>
       </w:r>
     </w:p>
     <w:p>
@@ -14704,6 +14692,7 @@
       </w:pPr>
       <w:r>
         <w:rPr>
+          <w:noProof/>
           <w:sz w:val="24"/>
           <w:szCs w:val="24"/>
         </w:rPr>
@@ -14887,7 +14876,6 @@
         <w:t xml:space="preserve"> estaba vacía y generaba errores de compilación; se completó con @Service y sus métodos, incluido </w:t>
       </w:r>
       <w:proofErr w:type="spellStart"/>
-      <w:proofErr w:type="gramStart"/>
       <w:r>
         <w:rPr>
           <w:rFonts w:ascii="Times New Roman" w:eastAsia="Times New Roman" w:hAnsi="Times New Roman" w:cs="Times New Roman"/>
@@ -14903,16 +14891,7 @@
           <w:sz w:val="24"/>
           <w:szCs w:val="24"/>
         </w:rPr>
-        <w:t>(</w:t>
-      </w:r>
-      <w:proofErr w:type="gramEnd"/>
-      <w:r>
-        <w:rPr>
-          <w:rFonts w:ascii="Times New Roman" w:eastAsia="Times New Roman" w:hAnsi="Times New Roman" w:cs="Times New Roman"/>
-          <w:sz w:val="24"/>
-          <w:szCs w:val="24"/>
-        </w:rPr>
-        <w:t>).</w:t>
+        <w:t>().</w:t>
       </w:r>
     </w:p>
     <w:p>
@@ -14974,7 +14953,6 @@
         <w:t xml:space="preserve">" porque el nombre de la base en </w:t>
       </w:r>
       <w:proofErr w:type="spellStart"/>
-      <w:proofErr w:type="gramStart"/>
       <w:r>
         <w:rPr>
           <w:rFonts w:ascii="Times New Roman" w:eastAsia="Times New Roman" w:hAnsi="Times New Roman" w:cs="Times New Roman"/>
@@ -14984,7 +14962,6 @@
         <w:t>application.properties</w:t>
       </w:r>
       <w:proofErr w:type="spellEnd"/>
-      <w:proofErr w:type="gramEnd"/>
       <w:r>
         <w:rPr>
           <w:rFonts w:ascii="Times New Roman" w:eastAsia="Times New Roman" w:hAnsi="Times New Roman" w:cs="Times New Roman"/>
@@ -15341,7 +15318,68 @@
     <w:p>
       <w:pPr>
         <w:spacing w:before="100" w:beforeAutospacing="1" w:after="100" w:afterAutospacing="1" w:line="240" w:lineRule="auto"/>
-        <w:ind w:left="720"/>
+        <w:rPr>
+          <w:rFonts w:ascii="Times New Roman" w:eastAsia="Times New Roman" w:hAnsi="Times New Roman" w:cs="Times New Roman"/>
+          <w:sz w:val="24"/>
+          <w:szCs w:val="24"/>
+        </w:rPr>
+      </w:pPr>
+    </w:p>
+    <w:p>
+      <w:pPr>
+        <w:spacing w:before="100" w:beforeAutospacing="1" w:after="100" w:afterAutospacing="1" w:line="240" w:lineRule="auto"/>
+        <w:rPr>
+          <w:rFonts w:ascii="Arial" w:eastAsia="Arial" w:hAnsi="Arial" w:cs="Arial"/>
+          <w:bCs/>
+        </w:rPr>
+      </w:pPr>
+      <w:r>
+        <w:rPr>
+          <w:rFonts w:ascii="Times New Roman" w:eastAsia="Times New Roman" w:hAnsi="Times New Roman" w:cs="Times New Roman"/>
+          <w:sz w:val="24"/>
+          <w:szCs w:val="24"/>
+        </w:rPr>
+        <w:t xml:space="preserve">GitHub: </w:t>
+      </w:r>
+      <w:hyperlink r:id="rId37" w:history="1">
+        <w:r>
+          <w:rPr>
+            <w:rStyle w:val="Hipervnculo"/>
+            <w:rFonts w:ascii="Arial" w:eastAsia="Arial" w:hAnsi="Arial" w:cs="Arial"/>
+            <w:bCs/>
+          </w:rPr>
+          <w:t>https://github.com/juandiegoramosenriquez-sys/Desarrollo-De-Aplicaciones-Web/tree/main/seman</w:t>
+        </w:r>
+        <w:r>
+          <w:rPr>
+            <w:rStyle w:val="Hipervnculo"/>
+            <w:rFonts w:ascii="Arial" w:eastAsia="Arial" w:hAnsi="Arial" w:cs="Arial"/>
+            <w:bCs/>
+          </w:rPr>
+          <w:t>a</w:t>
+        </w:r>
+        <w:r>
+          <w:rPr>
+            <w:rStyle w:val="Hipervnculo"/>
+            <w:rFonts w:ascii="Arial" w:eastAsia="Arial" w:hAnsi="Arial" w:cs="Arial"/>
+            <w:bCs/>
+          </w:rPr>
+          <w:t>-05</w:t>
+        </w:r>
+      </w:hyperlink>
+    </w:p>
+    <w:p>
+      <w:pPr>
+        <w:spacing w:before="100" w:beforeAutospacing="1" w:after="100" w:afterAutospacing="1" w:line="240" w:lineRule="auto"/>
+        <w:rPr>
+          <w:rFonts w:ascii="Arial" w:eastAsia="Arial" w:hAnsi="Arial" w:cs="Arial"/>
+          <w:b/>
+        </w:rPr>
+      </w:pPr>
+    </w:p>
+    <w:p>
+      <w:pPr>
+        <w:spacing w:before="100" w:beforeAutospacing="1" w:after="100" w:afterAutospacing="1" w:line="240" w:lineRule="auto"/>
         <w:rPr>
           <w:rFonts w:ascii="Arial" w:eastAsia="Arial" w:hAnsi="Arial" w:cs="Arial"/>
           <w:b/>

</xml_diff>